<commit_message>
Complete lab 4 report requirements
</commit_message>
<xml_diff>
--- a/lab4_report.docx
+++ b/lab4_report.docx
@@ -30,7 +30,7 @@
         <w:t xml:space="preserve">Короткий результат: </w:t>
       </w:r>
       <w:r>
-        <w:t>найкращою серед перевірених стала базова модель. Її точність на всій тестовій вибірці становить 80,14%. На перших 10 тестових зображеннях правильно розпізнано 9, а на 10 зовнішніх фотографіях - 4.</w:t>
+        <w:t>найкращою серед перевірених стала базова модель. Її точність на всій тестовій вибірці становить 80,14%. На перших 10 тестових зображеннях правильно розпізнано 9, а на 10 додаткових JPG-зображеннях, яких не було під час навчання, - 4.</w:t>
       </w:r>
     </w:p>
     <w:p>
@@ -731,7 +731,7 @@
               <w:rPr>
                 <w:sz w:val="18"/>
               </w:rPr>
-              <w:t>78,56%</w:t>
+              <w:t>78,25%</w:t>
             </w:r>
           </w:p>
         </w:tc>
@@ -763,7 +763,7 @@
               <w:rPr>
                 <w:sz w:val="18"/>
               </w:rPr>
-              <w:t>1,9 хв</w:t>
+              <w:t>1,8 хв</w:t>
             </w:r>
           </w:p>
         </w:tc>
@@ -951,7 +951,7 @@
               <w:rPr>
                 <w:sz w:val="18"/>
               </w:rPr>
-              <w:t>78,42%</w:t>
+              <w:t>78,90%</w:t>
             </w:r>
           </w:p>
         </w:tc>
@@ -982,7 +982,7 @@
               <w:rPr>
                 <w:sz w:val="18"/>
               </w:rPr>
-              <w:t>2,5 хв</w:t>
+              <w:t>2,3 хв</w:t>
             </w:r>
           </w:p>
         </w:tc>
@@ -1176,7 +1176,7 @@
               <w:rPr>
                 <w:sz w:val="18"/>
               </w:rPr>
-              <w:t>78,53%</w:t>
+              <w:t>77,30%</w:t>
             </w:r>
           </w:p>
         </w:tc>
@@ -1208,7 +1208,7 @@
               <w:rPr>
                 <w:sz w:val="18"/>
               </w:rPr>
-              <w:t>2,0 хв</w:t>
+              <w:t>1,8 хв</w:t>
             </w:r>
           </w:p>
         </w:tc>
@@ -1222,6 +1222,118 @@
     <w:p>
       <w:r>
         <w:t>Найкращий результат отримала базова модель - 80,14%. Збільшення ядра до 5x5 та додавання третього згорткового блока в цих дослідах не покращили результат. У кінці ноутбука саме базову модель збережено у файл cifar10_cnn_best.keras, потім завантажено з файлу і ще раз перевірено. Після завантаження точність залишилась 80,14%.</w:t>
+      </w:r>
+    </w:p>
+    <w:p>
+      <w:pPr>
+        <w:pStyle w:val="Heading1"/>
+      </w:pPr>
+      <w:r>
+        <w:t>Графіки навчання та їх аналіз</w:t>
+      </w:r>
+    </w:p>
+    <w:p>
+      <w:r>
+        <w:t>На базовій моделі точність навчальної вибірки зросла до 88,09%, а перевірочна точність наприкінці становила 81,14%. Після приблизно 17-ї епохи перевірочна точність трималася біля 80-81%, хоча навчальна точність продовжувала зростати. Найменше значення val_loss було 0,5699 на 22-й епосі, а на 25-й епосі воно становило 0,5880. Це показує початок невеликого перенавчання, тому суттєво збільшувати кількість епох без EarlyStopping не потрібно.</w:t>
+      </w:r>
+    </w:p>
+    <w:p>
+      <w:r>
+        <w:drawing>
+          <wp:inline xmlns:a="http://schemas.openxmlformats.org/drawingml/2006/main" xmlns:pic="http://schemas.openxmlformats.org/drawingml/2006/picture">
+            <wp:extent cx="5940000" cy="1948360"/>
+            <wp:docPr id="1" name="Picture 1"/>
+            <wp:cNvGraphicFramePr>
+              <a:graphicFrameLocks noChangeAspect="1"/>
+            </wp:cNvGraphicFramePr>
+            <a:graphic>
+              <a:graphicData uri="http://schemas.openxmlformats.org/drawingml/2006/picture">
+                <pic:pic>
+                  <pic:nvPicPr>
+                    <pic:cNvPr id="0" name="lab4_cell_22_0.png"/>
+                    <pic:cNvPicPr/>
+                  </pic:nvPicPr>
+                  <pic:blipFill>
+                    <a:blip r:embed="rId9"/>
+                    <a:stretch>
+                      <a:fillRect/>
+                    </a:stretch>
+                  </pic:blipFill>
+                  <pic:spPr>
+                    <a:xfrm>
+                      <a:off x="0" y="0"/>
+                      <a:ext cx="5940000" cy="1948360"/>
+                    </a:xfrm>
+                    <a:prstGeom prst="rect"/>
+                  </pic:spPr>
+                </pic:pic>
+              </a:graphicData>
+            </a:graphic>
+          </wp:inline>
+        </w:drawing>
+      </w:r>
+    </w:p>
+    <w:p>
+      <w:pPr>
+        <w:jc w:val="center"/>
+      </w:pPr>
+      <w:r>
+        <w:rPr>
+          <w:i/>
+        </w:rPr>
+        <w:t>Графіки точності та втрат базової моделі</w:t>
+      </w:r>
+    </w:p>
+    <w:p>
+      <w:r>
+        <w:t>На порівняльних графіках видно, що всі варіанти з двома згортковими блоками сходяться швидше за варіант із трьома блоками та RMSprop. У варіантах 1 і 2 після зростання навчальної точності перевірочні втрати перестають стабільно зменшуватися. За результатом на окремій тестовій вибірці базова модель залишилась найкращою.</w:t>
+      </w:r>
+    </w:p>
+    <w:p>
+      <w:r>
+        <w:drawing>
+          <wp:inline xmlns:a="http://schemas.openxmlformats.org/drawingml/2006/main" xmlns:pic="http://schemas.openxmlformats.org/drawingml/2006/picture">
+            <wp:extent cx="5940000" cy="2258029"/>
+            <wp:docPr id="2" name="Picture 2"/>
+            <wp:cNvGraphicFramePr>
+              <a:graphicFrameLocks noChangeAspect="1"/>
+            </wp:cNvGraphicFramePr>
+            <a:graphic>
+              <a:graphicData uri="http://schemas.openxmlformats.org/drawingml/2006/picture">
+                <pic:pic>
+                  <pic:nvPicPr>
+                    <pic:cNvPr id="0" name="lab4_cell_23_0.png"/>
+                    <pic:cNvPicPr/>
+                  </pic:nvPicPr>
+                  <pic:blipFill>
+                    <a:blip r:embed="rId10"/>
+                    <a:stretch>
+                      <a:fillRect/>
+                    </a:stretch>
+                  </pic:blipFill>
+                  <pic:spPr>
+                    <a:xfrm>
+                      <a:off x="0" y="0"/>
+                      <a:ext cx="5940000" cy="2258029"/>
+                    </a:xfrm>
+                    <a:prstGeom prst="rect"/>
+                  </pic:spPr>
+                </pic:pic>
+              </a:graphicData>
+            </a:graphic>
+          </wp:inline>
+        </w:drawing>
+      </w:r>
+    </w:p>
+    <w:p>
+      <w:pPr>
+        <w:jc w:val="center"/>
+      </w:pPr>
+      <w:r>
+        <w:rPr>
+          <w:i/>
+        </w:rPr>
+        <w:t>Порівняння перевірочної точності та втрат для чотирьох наборів гіперпараметрів</w:t>
       </w:r>
     </w:p>
     <w:p>
@@ -2687,12 +2799,12 @@
         <w:pStyle w:val="Heading1"/>
       </w:pPr>
       <w:r>
-        <w:t>Перевірка на зовнішніх зображеннях</w:t>
+        <w:t>Перевірка на власній добірці зображень</w:t>
       </w:r>
     </w:p>
     <w:p>
       <w:r>
-        <w:t>Додатково я перевірив 10 звичайних фотографій з тих самих класів. Кожне фото було зменшене до 32x32 пікселів і нормалізоване так само, як дані CIFAR-10.</w:t>
+        <w:t>Додатково я підібрав 10 JPG-зображень, по одному для кожного класу CIFAR-10. Цих зображень не було в навчальній або тестовій вибірці. Кожне зображення було зменшене до 32x32 пікселів і нормалізоване так само, як дані CIFAR-10.</w:t>
       </w:r>
     </w:p>
     <w:tbl>
@@ -2714,7 +2826,7 @@
         </w:trPr>
         <w:tc>
           <w:tcPr>
-            <w:tcW w:type="dxa" w:w="964"/>
+            <w:tcW w:type="dxa" w:w="2381"/>
             <w:vAlign w:val="center"/>
             <w:shd w:fill="1F4E78"/>
             <w:tcBorders>
@@ -2742,13 +2854,13 @@
                 <w:color w:val="FFFFFF"/>
                 <w:sz w:val="18"/>
               </w:rPr>
-              <w:t>Номер</w:t>
+              <w:t>Файл</w:t>
             </w:r>
           </w:p>
         </w:tc>
         <w:tc>
           <w:tcPr>
-            <w:tcW w:type="dxa" w:w="2721"/>
+            <w:tcW w:type="dxa" w:w="2381"/>
             <w:vAlign w:val="center"/>
             <w:shd w:fill="1F4E78"/>
             <w:tcBorders>
@@ -2782,7 +2894,7 @@
         </w:tc>
         <w:tc>
           <w:tcPr>
-            <w:tcW w:type="dxa" w:w="2948"/>
+            <w:tcW w:type="dxa" w:w="2551"/>
             <w:vAlign w:val="center"/>
             <w:shd w:fill="1F4E78"/>
             <w:tcBorders>
@@ -2816,7 +2928,7 @@
         </w:tc>
         <w:tc>
           <w:tcPr>
-            <w:tcW w:type="dxa" w:w="1701"/>
+            <w:tcW w:type="dxa" w:w="1247"/>
             <w:vAlign w:val="center"/>
             <w:shd w:fill="1F4E78"/>
             <w:tcBorders>
@@ -2852,7 +2964,7 @@
       <w:tr>
         <w:tc>
           <w:tcPr>
-            <w:tcW w:type="dxa" w:w="964"/>
+            <w:tcW w:type="dxa" w:w="2381"/>
             <w:vAlign w:val="center"/>
             <w:tcBorders>
               <w:top w:val="single" w:sz="6" w:color="D9D9D9"/>
@@ -2877,13 +2989,13 @@
               <w:rPr>
                 <w:sz w:val="18"/>
               </w:rPr>
-              <w:t>1</w:t>
+              <w:t>01_airplane.jpg</w:t>
             </w:r>
           </w:p>
         </w:tc>
         <w:tc>
           <w:tcPr>
-            <w:tcW w:type="dxa" w:w="2721"/>
+            <w:tcW w:type="dxa" w:w="2381"/>
             <w:vAlign w:val="center"/>
             <w:tcBorders>
               <w:top w:val="single" w:sz="6" w:color="D9D9D9"/>
@@ -2914,7 +3026,7 @@
         </w:tc>
         <w:tc>
           <w:tcPr>
-            <w:tcW w:type="dxa" w:w="2948"/>
+            <w:tcW w:type="dxa" w:w="2551"/>
             <w:vAlign w:val="center"/>
             <w:tcBorders>
               <w:top w:val="single" w:sz="6" w:color="D9D9D9"/>
@@ -2945,7 +3057,7 @@
         </w:tc>
         <w:tc>
           <w:tcPr>
-            <w:tcW w:type="dxa" w:w="1701"/>
+            <w:tcW w:type="dxa" w:w="1247"/>
             <w:vAlign w:val="center"/>
             <w:tcBorders>
               <w:top w:val="single" w:sz="6" w:color="D9D9D9"/>
@@ -2978,7 +3090,7 @@
       <w:tr>
         <w:tc>
           <w:tcPr>
-            <w:tcW w:type="dxa" w:w="964"/>
+            <w:tcW w:type="dxa" w:w="2381"/>
             <w:vAlign w:val="center"/>
             <w:tcBorders>
               <w:top w:val="single" w:sz="6" w:color="D9D9D9"/>
@@ -3004,13 +3116,13 @@
               <w:rPr>
                 <w:sz w:val="18"/>
               </w:rPr>
-              <w:t>2</w:t>
+              <w:t>02_automobile.jpg</w:t>
             </w:r>
           </w:p>
         </w:tc>
         <w:tc>
           <w:tcPr>
-            <w:tcW w:type="dxa" w:w="2721"/>
+            <w:tcW w:type="dxa" w:w="2381"/>
             <w:vAlign w:val="center"/>
             <w:tcBorders>
               <w:top w:val="single" w:sz="6" w:color="D9D9D9"/>
@@ -3042,7 +3154,7 @@
         </w:tc>
         <w:tc>
           <w:tcPr>
-            <w:tcW w:type="dxa" w:w="2948"/>
+            <w:tcW w:type="dxa" w:w="2551"/>
             <w:vAlign w:val="center"/>
             <w:tcBorders>
               <w:top w:val="single" w:sz="6" w:color="D9D9D9"/>
@@ -3074,7 +3186,7 @@
         </w:tc>
         <w:tc>
           <w:tcPr>
-            <w:tcW w:type="dxa" w:w="1701"/>
+            <w:tcW w:type="dxa" w:w="1247"/>
             <w:vAlign w:val="center"/>
             <w:tcBorders>
               <w:top w:val="single" w:sz="6" w:color="D9D9D9"/>
@@ -3108,7 +3220,7 @@
       <w:tr>
         <w:tc>
           <w:tcPr>
-            <w:tcW w:type="dxa" w:w="964"/>
+            <w:tcW w:type="dxa" w:w="2381"/>
             <w:vAlign w:val="center"/>
             <w:tcBorders>
               <w:top w:val="single" w:sz="6" w:color="D9D9D9"/>
@@ -3133,13 +3245,13 @@
               <w:rPr>
                 <w:sz w:val="18"/>
               </w:rPr>
-              <w:t>3</w:t>
+              <w:t>03_bird.jpg</w:t>
             </w:r>
           </w:p>
         </w:tc>
         <w:tc>
           <w:tcPr>
-            <w:tcW w:type="dxa" w:w="2721"/>
+            <w:tcW w:type="dxa" w:w="2381"/>
             <w:vAlign w:val="center"/>
             <w:tcBorders>
               <w:top w:val="single" w:sz="6" w:color="D9D9D9"/>
@@ -3170,7 +3282,7 @@
         </w:tc>
         <w:tc>
           <w:tcPr>
-            <w:tcW w:type="dxa" w:w="2948"/>
+            <w:tcW w:type="dxa" w:w="2551"/>
             <w:vAlign w:val="center"/>
             <w:tcBorders>
               <w:top w:val="single" w:sz="6" w:color="D9D9D9"/>
@@ -3201,7 +3313,7 @@
         </w:tc>
         <w:tc>
           <w:tcPr>
-            <w:tcW w:type="dxa" w:w="1701"/>
+            <w:tcW w:type="dxa" w:w="1247"/>
             <w:vAlign w:val="center"/>
             <w:tcBorders>
               <w:top w:val="single" w:sz="6" w:color="D9D9D9"/>
@@ -3234,7 +3346,7 @@
       <w:tr>
         <w:tc>
           <w:tcPr>
-            <w:tcW w:type="dxa" w:w="964"/>
+            <w:tcW w:type="dxa" w:w="2381"/>
             <w:vAlign w:val="center"/>
             <w:tcBorders>
               <w:top w:val="single" w:sz="6" w:color="D9D9D9"/>
@@ -3260,13 +3372,13 @@
               <w:rPr>
                 <w:sz w:val="18"/>
               </w:rPr>
-              <w:t>4</w:t>
+              <w:t>04_cat.jpg</w:t>
             </w:r>
           </w:p>
         </w:tc>
         <w:tc>
           <w:tcPr>
-            <w:tcW w:type="dxa" w:w="2721"/>
+            <w:tcW w:type="dxa" w:w="2381"/>
             <w:vAlign w:val="center"/>
             <w:tcBorders>
               <w:top w:val="single" w:sz="6" w:color="D9D9D9"/>
@@ -3298,7 +3410,7 @@
         </w:tc>
         <w:tc>
           <w:tcPr>
-            <w:tcW w:type="dxa" w:w="2948"/>
+            <w:tcW w:type="dxa" w:w="2551"/>
             <w:vAlign w:val="center"/>
             <w:tcBorders>
               <w:top w:val="single" w:sz="6" w:color="D9D9D9"/>
@@ -3330,7 +3442,7 @@
         </w:tc>
         <w:tc>
           <w:tcPr>
-            <w:tcW w:type="dxa" w:w="1701"/>
+            <w:tcW w:type="dxa" w:w="1247"/>
             <w:vAlign w:val="center"/>
             <w:tcBorders>
               <w:top w:val="single" w:sz="6" w:color="D9D9D9"/>
@@ -3364,7 +3476,7 @@
       <w:tr>
         <w:tc>
           <w:tcPr>
-            <w:tcW w:type="dxa" w:w="964"/>
+            <w:tcW w:type="dxa" w:w="2381"/>
             <w:vAlign w:val="center"/>
             <w:tcBorders>
               <w:top w:val="single" w:sz="6" w:color="D9D9D9"/>
@@ -3389,13 +3501,13 @@
               <w:rPr>
                 <w:sz w:val="18"/>
               </w:rPr>
-              <w:t>5</w:t>
+              <w:t>05_deer.jpg</w:t>
             </w:r>
           </w:p>
         </w:tc>
         <w:tc>
           <w:tcPr>
-            <w:tcW w:type="dxa" w:w="2721"/>
+            <w:tcW w:type="dxa" w:w="2381"/>
             <w:vAlign w:val="center"/>
             <w:tcBorders>
               <w:top w:val="single" w:sz="6" w:color="D9D9D9"/>
@@ -3426,7 +3538,7 @@
         </w:tc>
         <w:tc>
           <w:tcPr>
-            <w:tcW w:type="dxa" w:w="2948"/>
+            <w:tcW w:type="dxa" w:w="2551"/>
             <w:vAlign w:val="center"/>
             <w:tcBorders>
               <w:top w:val="single" w:sz="6" w:color="D9D9D9"/>
@@ -3457,7 +3569,7 @@
         </w:tc>
         <w:tc>
           <w:tcPr>
-            <w:tcW w:type="dxa" w:w="1701"/>
+            <w:tcW w:type="dxa" w:w="1247"/>
             <w:vAlign w:val="center"/>
             <w:tcBorders>
               <w:top w:val="single" w:sz="6" w:color="D9D9D9"/>
@@ -3490,7 +3602,7 @@
       <w:tr>
         <w:tc>
           <w:tcPr>
-            <w:tcW w:type="dxa" w:w="964"/>
+            <w:tcW w:type="dxa" w:w="2381"/>
             <w:vAlign w:val="center"/>
             <w:tcBorders>
               <w:top w:val="single" w:sz="6" w:color="D9D9D9"/>
@@ -3516,13 +3628,13 @@
               <w:rPr>
                 <w:sz w:val="18"/>
               </w:rPr>
-              <w:t>6</w:t>
+              <w:t>06_dog.jpg</w:t>
             </w:r>
           </w:p>
         </w:tc>
         <w:tc>
           <w:tcPr>
-            <w:tcW w:type="dxa" w:w="2721"/>
+            <w:tcW w:type="dxa" w:w="2381"/>
             <w:vAlign w:val="center"/>
             <w:tcBorders>
               <w:top w:val="single" w:sz="6" w:color="D9D9D9"/>
@@ -3554,7 +3666,7 @@
         </w:tc>
         <w:tc>
           <w:tcPr>
-            <w:tcW w:type="dxa" w:w="2948"/>
+            <w:tcW w:type="dxa" w:w="2551"/>
             <w:vAlign w:val="center"/>
             <w:tcBorders>
               <w:top w:val="single" w:sz="6" w:color="D9D9D9"/>
@@ -3586,7 +3698,7 @@
         </w:tc>
         <w:tc>
           <w:tcPr>
-            <w:tcW w:type="dxa" w:w="1701"/>
+            <w:tcW w:type="dxa" w:w="1247"/>
             <w:vAlign w:val="center"/>
             <w:tcBorders>
               <w:top w:val="single" w:sz="6" w:color="D9D9D9"/>
@@ -3620,7 +3732,7 @@
       <w:tr>
         <w:tc>
           <w:tcPr>
-            <w:tcW w:type="dxa" w:w="964"/>
+            <w:tcW w:type="dxa" w:w="2381"/>
             <w:vAlign w:val="center"/>
             <w:tcBorders>
               <w:top w:val="single" w:sz="6" w:color="D9D9D9"/>
@@ -3645,13 +3757,13 @@
               <w:rPr>
                 <w:sz w:val="18"/>
               </w:rPr>
-              <w:t>7</w:t>
+              <w:t>07_frog.jpg</w:t>
             </w:r>
           </w:p>
         </w:tc>
         <w:tc>
           <w:tcPr>
-            <w:tcW w:type="dxa" w:w="2721"/>
+            <w:tcW w:type="dxa" w:w="2381"/>
             <w:vAlign w:val="center"/>
             <w:tcBorders>
               <w:top w:val="single" w:sz="6" w:color="D9D9D9"/>
@@ -3682,7 +3794,7 @@
         </w:tc>
         <w:tc>
           <w:tcPr>
-            <w:tcW w:type="dxa" w:w="2948"/>
+            <w:tcW w:type="dxa" w:w="2551"/>
             <w:vAlign w:val="center"/>
             <w:tcBorders>
               <w:top w:val="single" w:sz="6" w:color="D9D9D9"/>
@@ -3713,7 +3825,7 @@
         </w:tc>
         <w:tc>
           <w:tcPr>
-            <w:tcW w:type="dxa" w:w="1701"/>
+            <w:tcW w:type="dxa" w:w="1247"/>
             <w:vAlign w:val="center"/>
             <w:tcBorders>
               <w:top w:val="single" w:sz="6" w:color="D9D9D9"/>
@@ -3746,7 +3858,7 @@
       <w:tr>
         <w:tc>
           <w:tcPr>
-            <w:tcW w:type="dxa" w:w="964"/>
+            <w:tcW w:type="dxa" w:w="2381"/>
             <w:vAlign w:val="center"/>
             <w:tcBorders>
               <w:top w:val="single" w:sz="6" w:color="D9D9D9"/>
@@ -3772,13 +3884,13 @@
               <w:rPr>
                 <w:sz w:val="18"/>
               </w:rPr>
-              <w:t>8</w:t>
+              <w:t>08_horse.jpg</w:t>
             </w:r>
           </w:p>
         </w:tc>
         <w:tc>
           <w:tcPr>
-            <w:tcW w:type="dxa" w:w="2721"/>
+            <w:tcW w:type="dxa" w:w="2381"/>
             <w:vAlign w:val="center"/>
             <w:tcBorders>
               <w:top w:val="single" w:sz="6" w:color="D9D9D9"/>
@@ -3810,7 +3922,7 @@
         </w:tc>
         <w:tc>
           <w:tcPr>
-            <w:tcW w:type="dxa" w:w="2948"/>
+            <w:tcW w:type="dxa" w:w="2551"/>
             <w:vAlign w:val="center"/>
             <w:tcBorders>
               <w:top w:val="single" w:sz="6" w:color="D9D9D9"/>
@@ -3842,7 +3954,7 @@
         </w:tc>
         <w:tc>
           <w:tcPr>
-            <w:tcW w:type="dxa" w:w="1701"/>
+            <w:tcW w:type="dxa" w:w="1247"/>
             <w:vAlign w:val="center"/>
             <w:tcBorders>
               <w:top w:val="single" w:sz="6" w:color="D9D9D9"/>
@@ -3876,7 +3988,7 @@
       <w:tr>
         <w:tc>
           <w:tcPr>
-            <w:tcW w:type="dxa" w:w="964"/>
+            <w:tcW w:type="dxa" w:w="2381"/>
             <w:vAlign w:val="center"/>
             <w:tcBorders>
               <w:top w:val="single" w:sz="6" w:color="D9D9D9"/>
@@ -3901,13 +4013,13 @@
               <w:rPr>
                 <w:sz w:val="18"/>
               </w:rPr>
-              <w:t>9</w:t>
+              <w:t>09_ship.jpg</w:t>
             </w:r>
           </w:p>
         </w:tc>
         <w:tc>
           <w:tcPr>
-            <w:tcW w:type="dxa" w:w="2721"/>
+            <w:tcW w:type="dxa" w:w="2381"/>
             <w:vAlign w:val="center"/>
             <w:tcBorders>
               <w:top w:val="single" w:sz="6" w:color="D9D9D9"/>
@@ -3938,7 +4050,7 @@
         </w:tc>
         <w:tc>
           <w:tcPr>
-            <w:tcW w:type="dxa" w:w="2948"/>
+            <w:tcW w:type="dxa" w:w="2551"/>
             <w:vAlign w:val="center"/>
             <w:tcBorders>
               <w:top w:val="single" w:sz="6" w:color="D9D9D9"/>
@@ -3969,7 +4081,7 @@
         </w:tc>
         <w:tc>
           <w:tcPr>
-            <w:tcW w:type="dxa" w:w="1701"/>
+            <w:tcW w:type="dxa" w:w="1247"/>
             <w:vAlign w:val="center"/>
             <w:tcBorders>
               <w:top w:val="single" w:sz="6" w:color="D9D9D9"/>
@@ -4002,7 +4114,7 @@
       <w:tr>
         <w:tc>
           <w:tcPr>
-            <w:tcW w:type="dxa" w:w="964"/>
+            <w:tcW w:type="dxa" w:w="2381"/>
             <w:vAlign w:val="center"/>
             <w:tcBorders>
               <w:top w:val="single" w:sz="6" w:color="D9D9D9"/>
@@ -4028,13 +4140,13 @@
               <w:rPr>
                 <w:sz w:val="18"/>
               </w:rPr>
-              <w:t>10</w:t>
+              <w:t>10_truck.jpg</w:t>
             </w:r>
           </w:p>
         </w:tc>
         <w:tc>
           <w:tcPr>
-            <w:tcW w:type="dxa" w:w="2721"/>
+            <w:tcW w:type="dxa" w:w="2381"/>
             <w:vAlign w:val="center"/>
             <w:tcBorders>
               <w:top w:val="single" w:sz="6" w:color="D9D9D9"/>
@@ -4066,7 +4178,7 @@
         </w:tc>
         <w:tc>
           <w:tcPr>
-            <w:tcW w:type="dxa" w:w="2948"/>
+            <w:tcW w:type="dxa" w:w="2551"/>
             <w:vAlign w:val="center"/>
             <w:tcBorders>
               <w:top w:val="single" w:sz="6" w:color="D9D9D9"/>
@@ -4098,7 +4210,7 @@
         </w:tc>
         <w:tc>
           <w:tcPr>
-            <w:tcW w:type="dxa" w:w="1701"/>
+            <w:tcW w:type="dxa" w:w="1247"/>
             <w:vAlign w:val="center"/>
             <w:tcBorders>
               <w:top w:val="single" w:sz="6" w:color="D9D9D9"/>
@@ -4137,7 +4249,7 @@
     </w:p>
     <w:p>
       <w:r>
-        <w:t>Правильно розпізнано 4 із 10 фотографій, тобто 40%. Гірший результат пояснюється тим, що модель навчалась на дуже маленьких і специфічно підготовлених зображеннях CIFAR-10. Звичайні фотографії мають інший фон, освітлення, ракурс і після зменшення до 32x32 втрачають багато деталей.</w:t>
+        <w:t>Правильно розпізнано 4 із 10 додаткових зображень, тобто 40%. Гірший результат пояснюється тим, що модель навчалась на дуже маленьких і специфічно підготовлених зображеннях CIFAR-10. Додаткові фотографії мають інший фон, освітлення, ракурс і після зменшення до 32x32 втрачають багато деталей. У ZIP-архіві є всі 10 JPG-файлів та файл SOURCES.txt із посиланнями на джерела.</w:t>
       </w:r>
     </w:p>
     <w:p>
@@ -4150,7 +4262,7 @@
     </w:p>
     <w:p>
       <w:r>
-        <w:t>Під час роботи я створив і навчив згорткову нейронну мережу, вручну порівняв чотири набори параметрів, зберіг найкращу модель і перевірив її після повторного завантаження. Найкраща тестова точність - 80,14%. На прикладах із самого CIFAR-10 модель працює помітно краще, ніж на звичайних фотографіях. Для подальшого покращення можна застосувати збільшення даних, BatchNormalization, більше епох з EarlyStopping або навчати модель на більшій кількості різноманітних фотографій.</w:t>
+        <w:t>Під час роботи я створив і навчив згорткову нейронну мережу, вручну порівняв чотири набори параметрів, побудував графіки точності та втрат, зберіг найкращу модель і перевірив її після повторного завантаження. Найкраща тестова точність - 80,14%. На 10 прикладах із тестової вибірки отримано 90%, а на власній добірці з 10 додаткових зображень - 40%. Для подальшого покращення можна застосувати збільшення даних, BatchNormalization, EarlyStopping або навчати модель на більшій кількості різноманітних фотографій.</w:t>
       </w:r>
     </w:p>
     <w:p>
@@ -4169,7 +4281,7 @@
         </w:rPr>
         <w:t xml:space="preserve">Ноутбук Google Colab: </w:t>
       </w:r>
-      <w:hyperlink r:id="rId9">
+      <w:hyperlink r:id="rId11">
         <w:r>
           <w:rPr>
             <w:color w:val="0563C1"/>
@@ -4187,7 +4299,7 @@
         </w:rPr>
         <w:t xml:space="preserve">Навчена модель у GitHub: </w:t>
       </w:r>
-      <w:hyperlink r:id="rId10">
+      <w:hyperlink r:id="rId12">
         <w:r>
           <w:rPr>
             <w:color w:val="0563C1"/>
@@ -4205,7 +4317,7 @@
         </w:rPr>
         <w:t xml:space="preserve">Архів із 10 зображеннями: </w:t>
       </w:r>
-      <w:hyperlink r:id="rId11">
+      <w:hyperlink r:id="rId13">
         <w:r>
           <w:rPr>
             <w:color w:val="0563C1"/>

</xml_diff>